<commit_message>
Team 4: feat: submitted currently completed work to Chief QA review
</commit_message>
<xml_diff>
--- a/03_Team_Work/Team4/Milestone_4_Interfaces_and_Data_Structures/TeamEditor/KU_M4_Team4_1.5.1_API_Register_User_Request_v01.docx
+++ b/03_Team_Work/Team4/Milestone_4_Interfaces_and_Data_Structures/TeamEditor/KU_M4_Team4_1.5.1_API_Register_User_Request_v01.docx
@@ -1,9 +1,11 @@
 
 <file path=word/document.xml><?xml version="1.0" encoding="utf-8"?>
-<w:document xmlns:wpc="http://schemas.microsoft.com/office/word/2010/wordprocessingCanvas" xmlns:cx="http://schemas.microsoft.com/office/drawing/2014/chartex" xmlns:cx1="http://schemas.microsoft.com/office/drawing/2015/9/8/chartex" xmlns:cx2="http://schemas.microsoft.com/office/drawing/2015/10/21/chartex" xmlns:cx3="http://schemas.microsoft.com/office/drawing/2016/5/9/chartex" xmlns:cx4="http://schemas.microsoft.com/office/drawing/2016/5/10/chartex" xmlns:cx5="http://schemas.microsoft.com/office/drawing/2016/5/11/chartex" xmlns:cx6="http://schemas.microsoft.com/office/drawing/2016/5/12/chartex" xmlns:cx7="http://schemas.microsoft.com/office/drawing/2016/5/13/chartex" xmlns:cx8="http://schemas.microsoft.com/office/drawing/2016/5/14/chartex" xmlns:mc="http://schemas.openxmlformats.org/markup-compatibility/2006" xmlns:m="http://schemas.openxmlformats.org/officeDocument/2006/math" xmlns:aink="http://schemas.microsoft.com/office/drawing/2016/ink" xmlns:am3d="http://schemas.microsoft.com/office/drawing/2017/model3d" xmlns:oel="http://schemas.microsoft.com/office/2019/extlst" xmlns:r="http://schemas.openxmlformats.org/officeDocument/2006/relationships" xmlns:wp14="http://schemas.microsoft.com/office/word/2010/wordprocessingDrawing" xmlns:wp="http://schemas.openxmlformats.org/drawingml/2006/wordprocessingDrawing" xmlns:wpg="http://schemas.microsoft.com/office/word/2010/wordprocessingGroup" xmlns:wpi="http://schemas.microsoft.com/office/word/2010/wordprocessingInk" xmlns:wps="http://schemas.microsoft.com/office/word/2010/wordprocessingShape" xmlns:o="urn:schemas-microsoft-com:office:office" xmlns:v="urn:schemas-microsoft-com:vml" xmlns:w10="urn:schemas-microsoft-com:office:word" xmlns:w="http://schemas.openxmlformats.org/wordprocessingml/2006/main" xmlns:w14="http://schemas.microsoft.com/office/word/2010/wordml" xmlns:w15="http://schemas.microsoft.com/office/word/2012/wordml" xmlns:w16cex="http://schemas.microsoft.com/office/word/2018/wordml/cex" xmlns:w16cid="http://schemas.microsoft.com/office/word/2016/wordml/cid" xmlns:w16="http://schemas.microsoft.com/office/word/2018/wordml" xmlns:w16sdtdh="http://schemas.microsoft.com/office/word/2020/wordml/sdtdatahash" xmlns:w16sdtfl="http://schemas.microsoft.com/office/word/2024/wordml/sdtformatlock" xmlns:w16se="http://schemas.microsoft.com/office/word/2015/wordml/symex" xmlns:w16du="http://schemas.microsoft.com/office/word/2023/wordml/word16du" xmlns:wne="http://schemas.microsoft.com/office/word/2006/wordml" mc:Ignorable="w14 w15 w16se w16cid w16 w16cex w16sdtdh w16sdtfl w16du wp14">
+<w:document xmlns:wpc="http://schemas.microsoft.com/office/word/2010/wordprocessingCanvas" xmlns:cx="http://schemas.microsoft.com/office/drawing/2014/chartex" xmlns:cx1="http://schemas.microsoft.com/office/drawing/2015/9/8/chartex" xmlns:cx2="http://schemas.microsoft.com/office/drawing/2015/10/21/chartex" xmlns:cx3="http://schemas.microsoft.com/office/drawing/2016/5/9/chartex" xmlns:cx4="http://schemas.microsoft.com/office/drawing/2016/5/10/chartex" xmlns:cx5="http://schemas.microsoft.com/office/drawing/2016/5/11/chartex" xmlns:cx6="http://schemas.microsoft.com/office/drawing/2016/5/12/chartex" xmlns:cx7="http://schemas.microsoft.com/office/drawing/2016/5/13/chartex" xmlns:cx8="http://schemas.microsoft.com/office/drawing/2016/5/14/chartex" xmlns:mc="http://schemas.openxmlformats.org/markup-compatibility/2006" xmlns:aink="http://schemas.microsoft.com/office/drawing/2016/ink" xmlns:am3d="http://schemas.microsoft.com/office/drawing/2017/model3d" xmlns:o="urn:schemas-microsoft-com:office:office" xmlns:oel="http://schemas.microsoft.com/office/2019/extlst" xmlns:r="http://schemas.openxmlformats.org/officeDocument/2006/relationships" xmlns:m="http://schemas.openxmlformats.org/officeDocument/2006/math" xmlns:v="urn:schemas-microsoft-com:vml" xmlns:wp14="http://schemas.microsoft.com/office/word/2010/wordprocessingDrawing" xmlns:wp="http://schemas.openxmlformats.org/drawingml/2006/wordprocessingDrawing" xmlns:w10="urn:schemas-microsoft-com:office:word" xmlns:w="http://schemas.openxmlformats.org/wordprocessingml/2006/main" xmlns:w14="http://schemas.microsoft.com/office/word/2010/wordml" xmlns:w15="http://schemas.microsoft.com/office/word/2012/wordml" xmlns:w16cex="http://schemas.microsoft.com/office/word/2018/wordml/cex" xmlns:w16cid="http://schemas.microsoft.com/office/word/2016/wordml/cid" xmlns:w16="http://schemas.microsoft.com/office/word/2018/wordml" xmlns:w16du="http://schemas.microsoft.com/office/word/2023/wordml/word16du" xmlns:w16sdtdh="http://schemas.microsoft.com/office/word/2020/wordml/sdtdatahash" xmlns:w16sdtfl="http://schemas.microsoft.com/office/word/2024/wordml/sdtformatlock" xmlns:w16se="http://schemas.microsoft.com/office/word/2015/wordml/symex" xmlns:wpg="http://schemas.microsoft.com/office/word/2010/wordprocessingGroup" xmlns:wpi="http://schemas.microsoft.com/office/word/2010/wordprocessingInk" xmlns:wne="http://schemas.microsoft.com/office/word/2006/wordml" xmlns:wps="http://schemas.microsoft.com/office/word/2010/wordprocessingShape" mc:Ignorable="w14 w15 w16se w16cid w16 w16cex w16sdtdh w16sdtfl w16du wp14">
   <w:body>
     <w:p>
       <w:pPr>
+        <w:keepNext/>
+        <w:outlineLvl w:val="2"/>
         <w:rPr>
           <w:rFonts w:ascii="Arial" w:hAnsi="Arial" w:cs="Arial"/>
           <w:b/>
@@ -20,7 +22,27 @@
           <w:sz w:val="27"/>
           <w:szCs w:val="27"/>
         </w:rPr>
-        <w:t xml:space="preserve">1.5.1 API </w:t>
+        <w:t>1.5.1</w:t>
+      </w:r>
+      <w:r>
+        <w:rPr>
+          <w:rFonts w:ascii="Arial" w:hAnsi="Arial" w:cs="Arial"/>
+          <w:b/>
+          <w:bCs/>
+          <w:sz w:val="27"/>
+          <w:szCs w:val="27"/>
+        </w:rPr>
+        <w:t>-</w:t>
+      </w:r>
+      <w:r>
+        <w:rPr>
+          <w:rFonts w:ascii="Arial" w:hAnsi="Arial" w:cs="Arial"/>
+          <w:b/>
+          <w:bCs/>
+          <w:sz w:val="27"/>
+          <w:szCs w:val="27"/>
+        </w:rPr>
+        <w:t xml:space="preserve">API </w:t>
       </w:r>
       <w:proofErr w:type="spellStart"/>
       <w:r>
@@ -470,7 +492,15 @@
                 <w:sz w:val="22"/>
                 <w:szCs w:val="22"/>
               </w:rPr>
-              <w:t>Password</w:t>
+              <w:t>p</w:t>
+            </w:r>
+            <w:r>
+              <w:rPr>
+                <w:rFonts w:ascii="Arial" w:hAnsi="Arial" w:cs="Arial"/>
+                <w:sz w:val="22"/>
+                <w:szCs w:val="22"/>
+              </w:rPr>
+              <w:t>assword</w:t>
             </w:r>
           </w:p>
         </w:tc>
@@ -764,7 +794,7 @@
 </file>
 
 <file path=word/styles.xml><?xml version="1.0" encoding="utf-8"?>
-<w:styles xmlns:mc="http://schemas.openxmlformats.org/markup-compatibility/2006" xmlns:r="http://schemas.openxmlformats.org/officeDocument/2006/relationships" xmlns:w="http://schemas.openxmlformats.org/wordprocessingml/2006/main" xmlns:w14="http://schemas.microsoft.com/office/word/2010/wordml" xmlns:w15="http://schemas.microsoft.com/office/word/2012/wordml" xmlns:w16cex="http://schemas.microsoft.com/office/word/2018/wordml/cex" xmlns:w16cid="http://schemas.microsoft.com/office/word/2016/wordml/cid" xmlns:w16="http://schemas.microsoft.com/office/word/2018/wordml" xmlns:w16sdtdh="http://schemas.microsoft.com/office/word/2020/wordml/sdtdatahash" xmlns:w16sdtfl="http://schemas.microsoft.com/office/word/2024/wordml/sdtformatlock" xmlns:w16se="http://schemas.microsoft.com/office/word/2015/wordml/symex" xmlns:w16du="http://schemas.microsoft.com/office/word/2023/wordml/word16du" mc:Ignorable="w14 w15 w16se w16cid w16 w16cex w16sdtdh w16sdtfl w16du">
+<w:styles xmlns:mc="http://schemas.openxmlformats.org/markup-compatibility/2006" xmlns:r="http://schemas.openxmlformats.org/officeDocument/2006/relationships" xmlns:w="http://schemas.openxmlformats.org/wordprocessingml/2006/main" xmlns:w14="http://schemas.microsoft.com/office/word/2010/wordml" xmlns:w15="http://schemas.microsoft.com/office/word/2012/wordml" xmlns:w16cex="http://schemas.microsoft.com/office/word/2018/wordml/cex" xmlns:w16cid="http://schemas.microsoft.com/office/word/2016/wordml/cid" xmlns:w16="http://schemas.microsoft.com/office/word/2018/wordml" xmlns:w16du="http://schemas.microsoft.com/office/word/2023/wordml/word16du" xmlns:w16sdtdh="http://schemas.microsoft.com/office/word/2020/wordml/sdtdatahash" xmlns:w16sdtfl="http://schemas.microsoft.com/office/word/2024/wordml/sdtformatlock" xmlns:w16se="http://schemas.microsoft.com/office/word/2015/wordml/symex" mc:Ignorable="w14 w15 w16se w16cid w16 w16cex w16sdtdh w16sdtfl w16du">
   <w:docDefaults>
     <w:rPrDefault>
       <w:rPr>

</xml_diff>